<commit_message>
Publish live prototype URL across README and submission write-up
Live at https://mastershield-ai.vercel.app

Co-Authored-By: Claude <noreply@anthropic.com>
Claude-Session: https://claude.ai/code/session_01MvMokvvQ2tagtGNYC7LcMb
</commit_message>
<xml_diff>
--- a/MasterShield_AI_Submission_Writeup.docx
+++ b/MasterShield_AI_Submission_Writeup.docx
@@ -333,7 +333,7 @@
               <w:rPr>
                 <w:sz w:val="16"/>
               </w:rPr>
-              <w:t>python web_app/server.py --port 8000  -&gt;  http://localhost:8000</w:t>
+              <w:t>LIVE, no setup required: https://mastershield-ai.vercel.app</w:t>
             </w:r>
           </w:p>
         </w:tc>
@@ -355,7 +355,7 @@
           <w:i w:val="0"/>
           <w:sz w:val="19"/>
         </w:rPr>
-        <w:t>Run the prototype in under a minute:</w:t>
+        <w:t>The prototype is hosted and requires no setup. To run it locally instead:</w:t>
       </w:r>
     </w:p>
     <w:p>

</xml_diff>